<commit_message>
fix: unbold explanation paragraph with first-line indent, clean Java icon, and render vector X close button
</commit_message>
<xml_diff>
--- a/examples/adpl_modul4_sample/LAPRAK_SAMPLE_ADPL_MODUL4.docx
+++ b/examples/adpl_modul4_sample/LAPRAK_SAMPLE_ADPL_MODUL4.docx
@@ -883,12 +883,13 @@
     </w:p>
     <w:p>
       <w:pPr>
-        <w:pStyle w:val="Heading1"/>
+        <w:spacing w:before="160" w:after="40"/>
         <w:jc w:val="both"/>
       </w:pPr>
       <w:r>
         <w:rPr>
           <w:rFonts w:ascii="Times New Roman" w:hAnsi="Times New Roman"/>
+          <w:b/>
           <w:sz w:val="22"/>
         </w:rPr>
         <w:t>1.) KoneksiDB.java</w:t>
@@ -896,12 +897,13 @@
     </w:p>
     <w:p>
       <w:pPr>
-        <w:pStyle w:val="Heading1"/>
+        <w:spacing w:before="80" w:after="40"/>
         <w:jc w:val="both"/>
       </w:pPr>
       <w:r>
         <w:rPr>
           <w:rFonts w:ascii="Times New Roman" w:hAnsi="Times New Roman"/>
+          <w:b/>
           <w:sz w:val="22"/>
         </w:rPr>
         <w:t>Kode</w:t>
@@ -909,7 +911,7 @@
     </w:p>
     <w:p>
       <w:pPr>
-        <w:pStyle w:val="Heading1"/>
+        <w:spacing w:before="80" w:after="120"/>
         <w:jc w:val="center"/>
       </w:pPr>
       <w:r>
@@ -949,12 +951,13 @@
     </w:p>
     <w:p>
       <w:pPr>
-        <w:pStyle w:val="Heading1"/>
+        <w:spacing w:before="80" w:after="40"/>
         <w:jc w:val="both"/>
       </w:pPr>
       <w:r>
         <w:rPr>
           <w:rFonts w:ascii="Times New Roman" w:hAnsi="Times New Roman"/>
+          <w:b/>
           <w:sz w:val="22"/>
         </w:rPr>
         <w:t>Penjelasan</w:t>
@@ -962,12 +965,14 @@
     </w:p>
     <w:p>
       <w:pPr>
-        <w:pStyle w:val="Heading1"/>
+        <w:spacing w:line="276" w:lineRule="auto" w:before="40" w:after="120"/>
+        <w:ind w:firstLine="576"/>
         <w:jc w:val="both"/>
       </w:pPr>
       <w:r>
         <w:rPr>
           <w:rFonts w:ascii="Times New Roman" w:hAnsi="Times New Roman"/>
+          <w:b w:val="0"/>
           <w:sz w:val="22"/>
         </w:rPr>
         <w:t>Class KoneksiDB bertugas buat ngebangun koneksi aplikasi Java ke database MySQL pake driver JDBC. Di sini dipake variabel statis conn biar koneksinya cuma dibuat sekali (pola singleton sederhana) terus bisa dipake ulang di seluruh class view dan controller.</w:t>
@@ -975,17 +980,18 @@
     </w:p>
     <w:p>
       <w:pPr>
-        <w:pStyle w:val="Heading1"/>
-      </w:pPr>
-    </w:p>
-    <w:p>
-      <w:pPr>
-        <w:pStyle w:val="Heading1"/>
+        <w:spacing w:before="40" w:after="40"/>
+      </w:pPr>
+    </w:p>
+    <w:p>
+      <w:pPr>
+        <w:spacing w:before="160" w:after="40"/>
         <w:jc w:val="both"/>
       </w:pPr>
       <w:r>
         <w:rPr>
           <w:rFonts w:ascii="Times New Roman" w:hAnsi="Times New Roman"/>
+          <w:b/>
           <w:sz w:val="22"/>
         </w:rPr>
         <w:t>2.) KasirForm.java</w:t>
@@ -993,12 +999,13 @@
     </w:p>
     <w:p>
       <w:pPr>
-        <w:pStyle w:val="Heading1"/>
+        <w:spacing w:before="80" w:after="40"/>
         <w:jc w:val="both"/>
       </w:pPr>
       <w:r>
         <w:rPr>
           <w:rFonts w:ascii="Times New Roman" w:hAnsi="Times New Roman"/>
+          <w:b/>
           <w:sz w:val="22"/>
         </w:rPr>
         <w:t>Kode</w:t>
@@ -1006,7 +1013,7 @@
     </w:p>
     <w:p>
       <w:pPr>
-        <w:pStyle w:val="Heading1"/>
+        <w:spacing w:before="80" w:after="120"/>
         <w:jc w:val="center"/>
       </w:pPr>
       <w:r>
@@ -1046,12 +1053,13 @@
     </w:p>
     <w:p>
       <w:pPr>
-        <w:pStyle w:val="Heading1"/>
+        <w:spacing w:before="80" w:after="40"/>
         <w:jc w:val="both"/>
       </w:pPr>
       <w:r>
         <w:rPr>
           <w:rFonts w:ascii="Times New Roman" w:hAnsi="Times New Roman"/>
+          <w:b/>
           <w:sz w:val="22"/>
         </w:rPr>
         <w:t>Penjelasan</w:t>
@@ -1059,12 +1067,14 @@
     </w:p>
     <w:p>
       <w:pPr>
-        <w:pStyle w:val="Heading1"/>
+        <w:spacing w:line="276" w:lineRule="auto" w:before="40" w:after="120"/>
+        <w:ind w:firstLine="576"/>
         <w:jc w:val="both"/>
       </w:pPr>
       <w:r>
         <w:rPr>
           <w:rFonts w:ascii="Times New Roman" w:hAnsi="Times New Roman"/>
+          <w:b w:val="0"/>
           <w:sz w:val="22"/>
         </w:rPr>
         <w:t>Class ini turunan dari JFrame yang nampilin form transaksi kasir. Method loadDataBuku() ngejalanin query SELECT * FROM buku ke database lewat KoneksiDB, terus hasilnya dimasukin baris demi baris ke DefaultTableModel biar otomatis muncul di tabel GUI.</w:t>
@@ -1072,17 +1082,18 @@
     </w:p>
     <w:p>
       <w:pPr>
-        <w:pStyle w:val="Heading1"/>
-      </w:pPr>
-    </w:p>
-    <w:p>
-      <w:pPr>
-        <w:pStyle w:val="Heading1"/>
+        <w:spacing w:before="40" w:after="40"/>
+      </w:pPr>
+    </w:p>
+    <w:p>
+      <w:pPr>
+        <w:spacing w:before="160" w:after="40"/>
         <w:jc w:val="both"/>
       </w:pPr>
       <w:r>
         <w:rPr>
           <w:rFonts w:ascii="Times New Roman" w:hAnsi="Times New Roman"/>
+          <w:b/>
           <w:sz w:val="22"/>
         </w:rPr>
         <w:t>Output</w:t>
@@ -1090,7 +1101,7 @@
     </w:p>
     <w:p>
       <w:pPr>
-        <w:pStyle w:val="Heading1"/>
+        <w:spacing w:before="80" w:after="120"/>
         <w:jc w:val="center"/>
       </w:pPr>
       <w:r>
@@ -1130,7 +1141,7 @@
     </w:p>
     <w:p>
       <w:pPr>
-        <w:pStyle w:val="Heading1"/>
+        <w:spacing w:before="80" w:after="120"/>
         <w:jc w:val="center"/>
       </w:pPr>
       <w:r>

</xml_diff>